<commit_message>
update, stena role ended jul 2025
</commit_message>
<xml_diff>
--- a/JamesPetherSorling.docx
+++ b/JamesPetherSorling.docx
@@ -1,6 +1,6 @@
 
 <file path=word/document.xml><?xml version="1.0" encoding="utf-8"?>
-<w:document xmlns:o="urn:schemas-microsoft-com:office:office" xmlns:r="http://schemas.openxmlformats.org/officeDocument/2006/relationships" xmlns:v="urn:schemas-microsoft-com:vml" xmlns:w="http://schemas.openxmlformats.org/wordprocessingml/2006/main" xmlns:w10="urn:schemas-microsoft-com:office:word" xmlns:wp="http://schemas.openxmlformats.org/drawingml/2006/wordprocessingDrawing" xmlns:wps="http://schemas.microsoft.com/office/word/2010/wordprocessingShape" xmlns:wpg="http://schemas.microsoft.com/office/word/2010/wordprocessingGroup" xmlns:mc="http://schemas.openxmlformats.org/markup-compatibility/2006" xmlns:wp14="http://schemas.microsoft.com/office/word/2010/wordprocessingDrawing" xmlns:w14="http://schemas.microsoft.com/office/word/2010/wordml" xmlns:w15="http://schemas.microsoft.com/office/word/2012/wordml" mc:Ignorable="w14 wp14 w15">
+<w:document xmlns:o="urn:schemas-microsoft-com:office:office" xmlns:r="http://schemas.openxmlformats.org/officeDocument/2006/relationships" xmlns:v="urn:schemas-microsoft-com:vml" xmlns:w="http://schemas.openxmlformats.org/wordprocessingml/2006/main" xmlns:w10="urn:schemas-microsoft-com:office:word" xmlns:wp="http://schemas.openxmlformats.org/drawingml/2006/wordprocessingDrawing" xmlns:pic="http://schemas.openxmlformats.org/drawingml/2006/picture" xmlns:wps="http://schemas.microsoft.com/office/word/2010/wordprocessingShape" xmlns:wpg="http://schemas.microsoft.com/office/word/2010/wordprocessingGroup" xmlns:mc="http://schemas.openxmlformats.org/markup-compatibility/2006" xmlns:wp14="http://schemas.microsoft.com/office/word/2010/wordprocessingDrawing" xmlns:w14="http://schemas.microsoft.com/office/word/2010/wordml" xmlns:w15="http://schemas.microsoft.com/office/word/2012/wordml" mc:Ignorable="w14 wp14 w15">
   <w:body>
     <w:p>
       <w:pPr>
@@ -118,7 +118,7 @@
           </mc:Choice>
           <mc:Fallback>
             <w:pict>
-              <v:rect id="shape_0" ID="Shape1" path="m0,0l-2147483645,0l-2147483645,-2147483646l0,-2147483646xe" fillcolor="white" stroked="t" o:allowincell="f" style="position:absolute;margin-left:0pt;margin-top:-1.55pt;width:467.95pt;height:1.45pt;mso-wrap-style:none;v-text-anchor:middle;mso-position-vertical:top">
+              <v:rect id="shape_0" fillcolor="white" stroked="t" o:allowincell="f" style="position:absolute;margin-left:0pt;margin-top:-1.55pt;width:467.95pt;height:1.45pt;mso-wrap-style:none;v-text-anchor:middle;mso-position-vertical:top">
                 <v:fill o:detectmouseclick="t" type="solid" color2="black"/>
                 <v:stroke color="black" joinstyle="round" endcap="flat"/>
                 <w10:wrap type="square"/>
@@ -204,7 +204,7 @@
           </mc:Choice>
           <mc:Fallback>
             <w:pict>
-              <v:rect id="shape_0" ID="Shape2" path="m0,0l-2147483645,0l-2147483645,-2147483646l0,-2147483646xe" fillcolor="white" stroked="t" o:allowincell="f" style="position:absolute;margin-left:0pt;margin-top:-1.55pt;width:467.95pt;height:1.45pt;mso-wrap-style:none;v-text-anchor:middle;mso-position-vertical:top">
+              <v:rect id="shape_0" fillcolor="white" stroked="t" o:allowincell="f" style="position:absolute;margin-left:0pt;margin-top:-1.55pt;width:467.95pt;height:1.45pt;mso-wrap-style:none;v-text-anchor:middle;mso-position-vertical:top">
                 <v:fill o:detectmouseclick="t" type="solid" color2="black"/>
                 <v:stroke color="black" joinstyle="round" endcap="flat"/>
                 <w10:wrap type="square"/>
@@ -445,7 +445,7 @@
         <w:pStyle w:val="Compact"/>
         <w:numPr>
           <w:ilvl w:val="0"/>
-          <w:numId w:val="30"/>
+          <w:numId w:val="1"/>
         </w:numPr>
         <w:rPr/>
       </w:pPr>
@@ -466,7 +466,7 @@
         <w:pStyle w:val="Compact"/>
         <w:numPr>
           <w:ilvl w:val="0"/>
-          <w:numId w:val="31"/>
+          <w:numId w:val="1"/>
         </w:numPr>
         <w:rPr/>
       </w:pPr>
@@ -487,7 +487,7 @@
         <w:pStyle w:val="Compact"/>
         <w:numPr>
           <w:ilvl w:val="0"/>
-          <w:numId w:val="32"/>
+          <w:numId w:val="1"/>
         </w:numPr>
         <w:rPr/>
       </w:pPr>
@@ -508,7 +508,7 @@
         <w:pStyle w:val="Compact"/>
         <w:numPr>
           <w:ilvl w:val="0"/>
-          <w:numId w:val="33"/>
+          <w:numId w:val="1"/>
         </w:numPr>
         <w:rPr/>
       </w:pPr>
@@ -559,7 +559,7 @@
         <w:pStyle w:val="Compact"/>
         <w:numPr>
           <w:ilvl w:val="0"/>
-          <w:numId w:val="34"/>
+          <w:numId w:val="1"/>
         </w:numPr>
         <w:rPr/>
       </w:pPr>
@@ -580,7 +580,7 @@
         <w:pStyle w:val="Compact"/>
         <w:numPr>
           <w:ilvl w:val="0"/>
-          <w:numId w:val="35"/>
+          <w:numId w:val="1"/>
         </w:numPr>
         <w:rPr/>
       </w:pPr>
@@ -628,7 +628,7 @@
         <w:pStyle w:val="Compact"/>
         <w:numPr>
           <w:ilvl w:val="0"/>
-          <w:numId w:val="36"/>
+          <w:numId w:val="1"/>
         </w:numPr>
         <w:rPr/>
       </w:pPr>
@@ -649,7 +649,7 @@
         <w:pStyle w:val="Compact"/>
         <w:numPr>
           <w:ilvl w:val="0"/>
-          <w:numId w:val="37"/>
+          <w:numId w:val="1"/>
         </w:numPr>
         <w:rPr/>
       </w:pPr>
@@ -690,7 +690,7 @@
         <w:pStyle w:val="Compact"/>
         <w:numPr>
           <w:ilvl w:val="0"/>
-          <w:numId w:val="38"/>
+          <w:numId w:val="1"/>
         </w:numPr>
         <w:rPr/>
       </w:pPr>
@@ -719,7 +719,7 @@
         <w:pStyle w:val="Compact"/>
         <w:numPr>
           <w:ilvl w:val="0"/>
-          <w:numId w:val="39"/>
+          <w:numId w:val="1"/>
         </w:numPr>
         <w:rPr/>
       </w:pPr>
@@ -748,7 +748,7 @@
         <w:pStyle w:val="Compact"/>
         <w:numPr>
           <w:ilvl w:val="0"/>
-          <w:numId w:val="40"/>
+          <w:numId w:val="1"/>
         </w:numPr>
         <w:rPr/>
       </w:pPr>
@@ -817,7 +817,7 @@
           </mc:Choice>
           <mc:Fallback>
             <w:pict>
-              <v:rect id="shape_0" ID="Shape3" path="m0,0l-2147483645,0l-2147483645,-2147483646l0,-2147483646xe" fillcolor="white" stroked="t" o:allowincell="f" style="position:absolute;margin-left:0pt;margin-top:-1.55pt;width:467.95pt;height:1.45pt;mso-wrap-style:none;v-text-anchor:middle;mso-position-vertical:top">
+              <v:rect id="shape_0" fillcolor="white" stroked="t" o:allowincell="f" style="position:absolute;margin-left:0pt;margin-top:-1.55pt;width:467.95pt;height:1.45pt;mso-wrap-style:none;v-text-anchor:middle;mso-position-vertical:top">
                 <v:fill o:detectmouseclick="t" type="solid" color2="black"/>
                 <v:stroke color="black" joinstyle="round" endcap="flat"/>
                 <w10:wrap type="square"/>
@@ -858,7 +858,7 @@
         <w:pStyle w:val="Compact"/>
         <w:numPr>
           <w:ilvl w:val="0"/>
-          <w:numId w:val="41"/>
+          <w:numId w:val="1"/>
         </w:numPr>
         <w:rPr/>
       </w:pPr>
@@ -900,7 +900,7 @@
         <w:pStyle w:val="Compact"/>
         <w:numPr>
           <w:ilvl w:val="0"/>
-          <w:numId w:val="42"/>
+          <w:numId w:val="1"/>
         </w:numPr>
         <w:rPr/>
       </w:pPr>
@@ -909,19 +909,18 @@
           <w:b/>
           <w:bCs/>
         </w:rPr>
-        <w:t>Oct 2024–Present</w:t>
-      </w:r>
-      <w:r>
-        <w:rPr/>
-        <w:t xml:space="preserve">: Application Security Officer, Stena </w:t>
-      </w:r>
-      <w:r>
-        <w:rPr/>
-        <w:t>AB</w:t>
-      </w:r>
-      <w:r>
-        <w:rPr/>
-        <w:t xml:space="preserve"> – Enhanced SDLC, threat modeling, global bug bounty management, security champion forums, cross-subsidiary governance.</w:t>
+        <w:t>Oct 2024–</w:t>
+      </w:r>
+      <w:r>
+        <w:rPr>
+          <w:b/>
+          <w:bCs/>
+        </w:rPr>
+        <w:t>Jul 2025</w:t>
+      </w:r>
+      <w:r>
+        <w:rPr/>
+        <w:t>: Application Security Officer, Stena AB – Enhanced SDLC, threat modeling, global bug bounty management, security champion forums, cross-subsidiary governance.</w:t>
       </w:r>
     </w:p>
     <w:p>
@@ -929,7 +928,7 @@
         <w:pStyle w:val="Compact"/>
         <w:numPr>
           <w:ilvl w:val="0"/>
-          <w:numId w:val="43"/>
+          <w:numId w:val="1"/>
         </w:numPr>
         <w:rPr/>
       </w:pPr>
@@ -950,7 +949,7 @@
         <w:pStyle w:val="Compact"/>
         <w:numPr>
           <w:ilvl w:val="0"/>
-          <w:numId w:val="44"/>
+          <w:numId w:val="1"/>
         </w:numPr>
         <w:rPr/>
       </w:pPr>
@@ -984,7 +983,7 @@
         <w:pStyle w:val="Compact"/>
         <w:numPr>
           <w:ilvl w:val="0"/>
-          <w:numId w:val="45"/>
+          <w:numId w:val="1"/>
         </w:numPr>
         <w:rPr/>
       </w:pPr>
@@ -1005,7 +1004,7 @@
         <w:pStyle w:val="Compact"/>
         <w:numPr>
           <w:ilvl w:val="0"/>
-          <w:numId w:val="46"/>
+          <w:numId w:val="1"/>
         </w:numPr>
         <w:rPr/>
       </w:pPr>
@@ -1039,7 +1038,7 @@
         <w:pStyle w:val="Compact"/>
         <w:numPr>
           <w:ilvl w:val="0"/>
-          <w:numId w:val="47"/>
+          <w:numId w:val="1"/>
         </w:numPr>
         <w:rPr/>
       </w:pPr>
@@ -1060,7 +1059,7 @@
         <w:pStyle w:val="Compact"/>
         <w:numPr>
           <w:ilvl w:val="0"/>
-          <w:numId w:val="48"/>
+          <w:numId w:val="1"/>
         </w:numPr>
         <w:rPr/>
       </w:pPr>
@@ -1081,7 +1080,7 @@
         <w:pStyle w:val="Compact"/>
         <w:numPr>
           <w:ilvl w:val="0"/>
-          <w:numId w:val="49"/>
+          <w:numId w:val="1"/>
         </w:numPr>
         <w:rPr/>
       </w:pPr>
@@ -1102,7 +1101,7 @@
         <w:pStyle w:val="Compact"/>
         <w:numPr>
           <w:ilvl w:val="0"/>
-          <w:numId w:val="50"/>
+          <w:numId w:val="1"/>
         </w:numPr>
         <w:rPr/>
       </w:pPr>
@@ -1123,7 +1122,7 @@
         <w:pStyle w:val="Compact"/>
         <w:numPr>
           <w:ilvl w:val="0"/>
-          <w:numId w:val="51"/>
+          <w:numId w:val="1"/>
         </w:numPr>
         <w:rPr/>
       </w:pPr>
@@ -1157,7 +1156,7 @@
         <w:pStyle w:val="Compact"/>
         <w:numPr>
           <w:ilvl w:val="0"/>
-          <w:numId w:val="52"/>
+          <w:numId w:val="1"/>
         </w:numPr>
         <w:rPr/>
       </w:pPr>
@@ -1178,7 +1177,7 @@
         <w:pStyle w:val="Compact"/>
         <w:numPr>
           <w:ilvl w:val="0"/>
-          <w:numId w:val="53"/>
+          <w:numId w:val="1"/>
         </w:numPr>
         <w:rPr/>
       </w:pPr>
@@ -1199,7 +1198,7 @@
         <w:pStyle w:val="Compact"/>
         <w:numPr>
           <w:ilvl w:val="0"/>
-          <w:numId w:val="54"/>
+          <w:numId w:val="1"/>
         </w:numPr>
         <w:rPr/>
       </w:pPr>
@@ -1233,7 +1232,7 @@
         <w:pStyle w:val="Compact"/>
         <w:numPr>
           <w:ilvl w:val="0"/>
-          <w:numId w:val="55"/>
+          <w:numId w:val="1"/>
         </w:numPr>
         <w:rPr/>
       </w:pPr>
@@ -1254,7 +1253,7 @@
         <w:pStyle w:val="Compact"/>
         <w:numPr>
           <w:ilvl w:val="0"/>
-          <w:numId w:val="56"/>
+          <w:numId w:val="1"/>
         </w:numPr>
         <w:rPr/>
       </w:pPr>
@@ -1323,7 +1322,7 @@
           </mc:Choice>
           <mc:Fallback>
             <w:pict>
-              <v:rect id="shape_0" ID="Shape4" path="m0,0l-2147483645,0l-2147483645,-2147483646l0,-2147483646xe" fillcolor="white" stroked="t" o:allowincell="f" style="position:absolute;margin-left:0pt;margin-top:-1.55pt;width:467.95pt;height:1.45pt;mso-wrap-style:none;v-text-anchor:middle;mso-position-vertical:top">
+              <v:rect id="shape_0" fillcolor="white" stroked="t" o:allowincell="f" style="position:absolute;margin-left:0pt;margin-top:-1.55pt;width:467.95pt;height:1.45pt;mso-wrap-style:none;v-text-anchor:middle;mso-position-vertical:top">
                 <v:fill o:detectmouseclick="t" type="solid" color2="black"/>
                 <v:stroke color="black" joinstyle="round" endcap="flat"/>
                 <w10:wrap type="square"/>
@@ -1507,7 +1506,7 @@
           </mc:Choice>
           <mc:Fallback>
             <w:pict>
-              <v:rect id="shape_0" ID="Shape5" path="m0,0l-2147483645,0l-2147483645,-2147483646l0,-2147483646xe" fillcolor="white" stroked="t" o:allowincell="f" style="position:absolute;margin-left:0pt;margin-top:-1.55pt;width:467.95pt;height:1.45pt;mso-wrap-style:none;v-text-anchor:middle;mso-position-vertical:top">
+              <v:rect id="shape_0" fillcolor="white" stroked="t" o:allowincell="f" style="position:absolute;margin-left:0pt;margin-top:-1.55pt;width:467.95pt;height:1.45pt;mso-wrap-style:none;v-text-anchor:middle;mso-position-vertical:top">
                 <v:fill o:detectmouseclick="t" type="solid" color2="black"/>
                 <v:stroke color="black" joinstyle="round" endcap="flat"/>
                 <w10:wrap type="square"/>
@@ -1570,7 +1569,7 @@
           </mc:Choice>
           <mc:Fallback>
             <w:pict>
-              <v:rect id="shape_0" ID="Shape6" path="m0,0l-2147483645,0l-2147483645,-2147483646l0,-2147483646xe" fillcolor="white" stroked="t" o:allowincell="f" style="position:absolute;margin-left:0pt;margin-top:-1.55pt;width:467.95pt;height:1.45pt;mso-wrap-style:none;v-text-anchor:middle;mso-position-vertical:top">
+              <v:rect id="shape_0" fillcolor="white" stroked="t" o:allowincell="f" style="position:absolute;margin-left:0pt;margin-top:-1.55pt;width:467.95pt;height:1.45pt;mso-wrap-style:none;v-text-anchor:middle;mso-position-vertical:top">
                 <v:fill o:detectmouseclick="t" type="solid" color2="black"/>
                 <v:stroke color="black" joinstyle="round" endcap="flat"/>
                 <w10:wrap type="square"/>
@@ -5667,87 +5666,6 @@
   <w:num w:numId="29">
     <w:abstractNumId w:val="29"/>
   </w:num>
-  <w:num w:numId="30">
-    <w:abstractNumId w:val="1"/>
-  </w:num>
-  <w:num w:numId="31">
-    <w:abstractNumId w:val="1"/>
-  </w:num>
-  <w:num w:numId="32">
-    <w:abstractNumId w:val="1"/>
-  </w:num>
-  <w:num w:numId="33">
-    <w:abstractNumId w:val="1"/>
-  </w:num>
-  <w:num w:numId="34">
-    <w:abstractNumId w:val="1"/>
-  </w:num>
-  <w:num w:numId="35">
-    <w:abstractNumId w:val="1"/>
-  </w:num>
-  <w:num w:numId="36">
-    <w:abstractNumId w:val="1"/>
-  </w:num>
-  <w:num w:numId="37">
-    <w:abstractNumId w:val="1"/>
-  </w:num>
-  <w:num w:numId="38">
-    <w:abstractNumId w:val="1"/>
-  </w:num>
-  <w:num w:numId="39">
-    <w:abstractNumId w:val="1"/>
-  </w:num>
-  <w:num w:numId="40">
-    <w:abstractNumId w:val="1"/>
-  </w:num>
-  <w:num w:numId="41">
-    <w:abstractNumId w:val="1"/>
-  </w:num>
-  <w:num w:numId="42">
-    <w:abstractNumId w:val="1"/>
-  </w:num>
-  <w:num w:numId="43">
-    <w:abstractNumId w:val="1"/>
-  </w:num>
-  <w:num w:numId="44">
-    <w:abstractNumId w:val="1"/>
-  </w:num>
-  <w:num w:numId="45">
-    <w:abstractNumId w:val="1"/>
-  </w:num>
-  <w:num w:numId="46">
-    <w:abstractNumId w:val="1"/>
-  </w:num>
-  <w:num w:numId="47">
-    <w:abstractNumId w:val="1"/>
-  </w:num>
-  <w:num w:numId="48">
-    <w:abstractNumId w:val="1"/>
-  </w:num>
-  <w:num w:numId="49">
-    <w:abstractNumId w:val="1"/>
-  </w:num>
-  <w:num w:numId="50">
-    <w:abstractNumId w:val="1"/>
-  </w:num>
-  <w:num w:numId="51">
-    <w:abstractNumId w:val="1"/>
-  </w:num>
-  <w:num w:numId="52">
-    <w:abstractNumId w:val="1"/>
-  </w:num>
-  <w:num w:numId="53">
-    <w:abstractNumId w:val="1"/>
-  </w:num>
-  <w:num w:numId="54">
-    <w:abstractNumId w:val="1"/>
-  </w:num>
-  <w:num w:numId="55">
-    <w:abstractNumId w:val="1"/>
-  </w:num>
-  <w:num w:numId="56">
-    <w:abstractNumId w:val="1"/>
-  </w:num>
 </w:numbering>
 </file>
 
@@ -5789,7 +5707,7 @@
     </w:rPr>
   </w:style>
   <w:style w:type="paragraph" w:styleId="Heading1">
-    <w:name w:val="Heading 1"/>
+    <w:name w:val="heading 1"/>
     <w:basedOn w:val="Normal"/>
     <w:next w:val="BodyText"/>
     <w:link w:val="Heading1Char"/>
@@ -5810,7 +5728,7 @@
     </w:rPr>
   </w:style>
   <w:style w:type="paragraph" w:styleId="Heading2">
-    <w:name w:val="Heading 2"/>
+    <w:name w:val="heading 2"/>
     <w:basedOn w:val="Normal"/>
     <w:next w:val="BodyText"/>
     <w:link w:val="Heading2Char"/>
@@ -5833,7 +5751,7 @@
     </w:rPr>
   </w:style>
   <w:style w:type="paragraph" w:styleId="Heading3">
-    <w:name w:val="Heading 3"/>
+    <w:name w:val="heading 3"/>
     <w:basedOn w:val="Normal"/>
     <w:next w:val="BodyText"/>
     <w:link w:val="Heading3Char"/>
@@ -5856,7 +5774,7 @@
     </w:rPr>
   </w:style>
   <w:style w:type="paragraph" w:styleId="Heading4">
-    <w:name w:val="Heading 4"/>
+    <w:name w:val="heading 4"/>
     <w:basedOn w:val="Normal"/>
     <w:next w:val="BodyText"/>
     <w:link w:val="Heading4Char"/>
@@ -5879,7 +5797,7 @@
     </w:rPr>
   </w:style>
   <w:style w:type="paragraph" w:styleId="Heading5">
-    <w:name w:val="Heading 5"/>
+    <w:name w:val="heading 5"/>
     <w:basedOn w:val="Normal"/>
     <w:next w:val="BodyText"/>
     <w:link w:val="Heading5Char"/>
@@ -5900,7 +5818,7 @@
     </w:rPr>
   </w:style>
   <w:style w:type="paragraph" w:styleId="Heading6">
-    <w:name w:val="Heading 6"/>
+    <w:name w:val="heading 6"/>
     <w:basedOn w:val="Normal"/>
     <w:next w:val="BodyText"/>
     <w:link w:val="Heading6Char"/>
@@ -5923,7 +5841,7 @@
     </w:rPr>
   </w:style>
   <w:style w:type="paragraph" w:styleId="Heading7">
-    <w:name w:val="Heading 7"/>
+    <w:name w:val="heading 7"/>
     <w:basedOn w:val="Normal"/>
     <w:next w:val="BodyText"/>
     <w:link w:val="Heading7Char"/>
@@ -5944,7 +5862,7 @@
     </w:rPr>
   </w:style>
   <w:style w:type="paragraph" w:styleId="Heading8">
-    <w:name w:val="Heading 8"/>
+    <w:name w:val="heading 8"/>
     <w:basedOn w:val="Normal"/>
     <w:next w:val="BodyText"/>
     <w:link w:val="Heading8Char"/>
@@ -5967,7 +5885,7 @@
     </w:rPr>
   </w:style>
   <w:style w:type="paragraph" w:styleId="Heading9">
-    <w:name w:val="Heading 9"/>
+    <w:name w:val="heading 9"/>
     <w:basedOn w:val="Normal"/>
     <w:next w:val="BodyText"/>
     <w:link w:val="Heading9Char"/>
@@ -6173,15 +6091,22 @@
     <w:qFormat/>
     <w:rPr/>
   </w:style>
-  <w:style w:type="character" w:styleId="FootnoteCharacters">
-    <w:name w:val="Footnote Characters"/>
+  <w:style w:type="character" w:styleId="FootnoteCharactersuser">
+    <w:name w:val="Footnote Characters (user)"/>
     <w:qFormat/>
     <w:rPr>
       <w:vertAlign w:val="superscript"/>
     </w:rPr>
   </w:style>
+  <w:style w:type="character" w:styleId="FootnoteCharacters">
+    <w:name w:val="Footnote Characters"/>
+    <w:qFormat/>
+    <w:rPr>
+      <w:vertAlign w:val="superscript"/>
+    </w:rPr>
+  </w:style>
   <w:style w:type="character" w:styleId="FootnoteReference">
-    <w:name w:val="Footnote Reference"/>
+    <w:name w:val="footnote reference"/>
     <w:rPr>
       <w:vertAlign w:val="superscript"/>
     </w:rPr>
@@ -6484,7 +6409,7 @@
     </w:rPr>
   </w:style>
   <w:style w:type="paragraph" w:styleId="Caption">
-    <w:name w:val="Caption"/>
+    <w:name w:val="caption"/>
     <w:basedOn w:val="Normal"/>
     <w:link w:val="BodyTextChar"/>
     <w:qFormat/>
@@ -6657,7 +6582,7 @@
     <w:rPr/>
   </w:style>
   <w:style w:type="paragraph" w:styleId="FootnoteText">
-    <w:name w:val="Footnote Text"/>
+    <w:name w:val="footnote text"/>
     <w:basedOn w:val="Normal"/>
     <w:uiPriority w:val="9"/>
     <w:unhideWhenUsed/>
@@ -6732,7 +6657,7 @@
     <w:rPr/>
   </w:style>
   <w:style w:type="paragraph" w:styleId="IndexHeading">
-    <w:name w:val="Index Heading"/>
+    <w:name w:val="index heading"/>
     <w:basedOn w:val="Heading"/>
     <w:pPr/>
     <w:rPr/>

</xml_diff>

<commit_message>
chore(release): deploy version v1.0.3 to gh-pages
</commit_message>
<xml_diff>
--- a/JamesPetherSorling.docx
+++ b/JamesPetherSorling.docx
@@ -1,6 +1,6 @@
 
 <file path=word/document.xml><?xml version="1.0" encoding="utf-8"?>
-<w:document xmlns:o="urn:schemas-microsoft-com:office:office" xmlns:r="http://schemas.openxmlformats.org/officeDocument/2006/relationships" xmlns:v="urn:schemas-microsoft-com:vml" xmlns:w="http://schemas.openxmlformats.org/wordprocessingml/2006/main" xmlns:w10="urn:schemas-microsoft-com:office:word" xmlns:wp="http://schemas.openxmlformats.org/drawingml/2006/wordprocessingDrawing" xmlns:wps="http://schemas.microsoft.com/office/word/2010/wordprocessingShape" xmlns:wpg="http://schemas.microsoft.com/office/word/2010/wordprocessingGroup" xmlns:mc="http://schemas.openxmlformats.org/markup-compatibility/2006" xmlns:wp14="http://schemas.microsoft.com/office/word/2010/wordprocessingDrawing" xmlns:w14="http://schemas.microsoft.com/office/word/2010/wordml" xmlns:w15="http://schemas.microsoft.com/office/word/2012/wordml" mc:Ignorable="w14 wp14 w15">
+<w:document xmlns:o="urn:schemas-microsoft-com:office:office" xmlns:r="http://schemas.openxmlformats.org/officeDocument/2006/relationships" xmlns:v="urn:schemas-microsoft-com:vml" xmlns:w="http://schemas.openxmlformats.org/wordprocessingml/2006/main" xmlns:w10="urn:schemas-microsoft-com:office:word" xmlns:wp="http://schemas.openxmlformats.org/drawingml/2006/wordprocessingDrawing" xmlns:pic="http://schemas.openxmlformats.org/drawingml/2006/picture" xmlns:wps="http://schemas.microsoft.com/office/word/2010/wordprocessingShape" xmlns:wpg="http://schemas.microsoft.com/office/word/2010/wordprocessingGroup" xmlns:mc="http://schemas.openxmlformats.org/markup-compatibility/2006" xmlns:wp14="http://schemas.microsoft.com/office/word/2010/wordprocessingDrawing" xmlns:w14="http://schemas.microsoft.com/office/word/2010/wordml" xmlns:w15="http://schemas.microsoft.com/office/word/2012/wordml" mc:Ignorable="w14 wp14 w15">
   <w:body>
     <w:p>
       <w:pPr>
@@ -118,7 +118,7 @@
           </mc:Choice>
           <mc:Fallback>
             <w:pict>
-              <v:rect id="shape_0" ID="Shape1" path="m0,0l-2147483645,0l-2147483645,-2147483646l0,-2147483646xe" fillcolor="white" stroked="t" o:allowincell="f" style="position:absolute;margin-left:0pt;margin-top:-1.55pt;width:467.95pt;height:1.45pt;mso-wrap-style:none;v-text-anchor:middle;mso-position-vertical:top">
+              <v:rect id="shape_0" fillcolor="white" stroked="t" o:allowincell="f" style="position:absolute;margin-left:0pt;margin-top:-1.55pt;width:467.95pt;height:1.45pt;mso-wrap-style:none;v-text-anchor:middle;mso-position-vertical:top">
                 <v:fill o:detectmouseclick="t" type="solid" color2="black"/>
                 <v:stroke color="black" joinstyle="round" endcap="flat"/>
                 <w10:wrap type="square"/>
@@ -204,7 +204,7 @@
           </mc:Choice>
           <mc:Fallback>
             <w:pict>
-              <v:rect id="shape_0" ID="Shape2" path="m0,0l-2147483645,0l-2147483645,-2147483646l0,-2147483646xe" fillcolor="white" stroked="t" o:allowincell="f" style="position:absolute;margin-left:0pt;margin-top:-1.55pt;width:467.95pt;height:1.45pt;mso-wrap-style:none;v-text-anchor:middle;mso-position-vertical:top">
+              <v:rect id="shape_0" fillcolor="white" stroked="t" o:allowincell="f" style="position:absolute;margin-left:0pt;margin-top:-1.55pt;width:467.95pt;height:1.45pt;mso-wrap-style:none;v-text-anchor:middle;mso-position-vertical:top">
                 <v:fill o:detectmouseclick="t" type="solid" color2="black"/>
                 <v:stroke color="black" joinstyle="round" endcap="flat"/>
                 <w10:wrap type="square"/>
@@ -445,7 +445,7 @@
         <w:pStyle w:val="Compact"/>
         <w:numPr>
           <w:ilvl w:val="0"/>
-          <w:numId w:val="30"/>
+          <w:numId w:val="1"/>
         </w:numPr>
         <w:rPr/>
       </w:pPr>
@@ -466,7 +466,7 @@
         <w:pStyle w:val="Compact"/>
         <w:numPr>
           <w:ilvl w:val="0"/>
-          <w:numId w:val="31"/>
+          <w:numId w:val="1"/>
         </w:numPr>
         <w:rPr/>
       </w:pPr>
@@ -487,7 +487,7 @@
         <w:pStyle w:val="Compact"/>
         <w:numPr>
           <w:ilvl w:val="0"/>
-          <w:numId w:val="32"/>
+          <w:numId w:val="1"/>
         </w:numPr>
         <w:rPr/>
       </w:pPr>
@@ -508,7 +508,7 @@
         <w:pStyle w:val="Compact"/>
         <w:numPr>
           <w:ilvl w:val="0"/>
-          <w:numId w:val="33"/>
+          <w:numId w:val="1"/>
         </w:numPr>
         <w:rPr/>
       </w:pPr>
@@ -559,7 +559,7 @@
         <w:pStyle w:val="Compact"/>
         <w:numPr>
           <w:ilvl w:val="0"/>
-          <w:numId w:val="34"/>
+          <w:numId w:val="1"/>
         </w:numPr>
         <w:rPr/>
       </w:pPr>
@@ -580,7 +580,7 @@
         <w:pStyle w:val="Compact"/>
         <w:numPr>
           <w:ilvl w:val="0"/>
-          <w:numId w:val="35"/>
+          <w:numId w:val="1"/>
         </w:numPr>
         <w:rPr/>
       </w:pPr>
@@ -628,7 +628,7 @@
         <w:pStyle w:val="Compact"/>
         <w:numPr>
           <w:ilvl w:val="0"/>
-          <w:numId w:val="36"/>
+          <w:numId w:val="1"/>
         </w:numPr>
         <w:rPr/>
       </w:pPr>
@@ -649,7 +649,7 @@
         <w:pStyle w:val="Compact"/>
         <w:numPr>
           <w:ilvl w:val="0"/>
-          <w:numId w:val="37"/>
+          <w:numId w:val="1"/>
         </w:numPr>
         <w:rPr/>
       </w:pPr>
@@ -690,7 +690,7 @@
         <w:pStyle w:val="Compact"/>
         <w:numPr>
           <w:ilvl w:val="0"/>
-          <w:numId w:val="38"/>
+          <w:numId w:val="1"/>
         </w:numPr>
         <w:rPr/>
       </w:pPr>
@@ -719,7 +719,7 @@
         <w:pStyle w:val="Compact"/>
         <w:numPr>
           <w:ilvl w:val="0"/>
-          <w:numId w:val="39"/>
+          <w:numId w:val="1"/>
         </w:numPr>
         <w:rPr/>
       </w:pPr>
@@ -748,7 +748,7 @@
         <w:pStyle w:val="Compact"/>
         <w:numPr>
           <w:ilvl w:val="0"/>
-          <w:numId w:val="40"/>
+          <w:numId w:val="1"/>
         </w:numPr>
         <w:rPr/>
       </w:pPr>
@@ -817,7 +817,7 @@
           </mc:Choice>
           <mc:Fallback>
             <w:pict>
-              <v:rect id="shape_0" ID="Shape3" path="m0,0l-2147483645,0l-2147483645,-2147483646l0,-2147483646xe" fillcolor="white" stroked="t" o:allowincell="f" style="position:absolute;margin-left:0pt;margin-top:-1.55pt;width:467.95pt;height:1.45pt;mso-wrap-style:none;v-text-anchor:middle;mso-position-vertical:top">
+              <v:rect id="shape_0" fillcolor="white" stroked="t" o:allowincell="f" style="position:absolute;margin-left:0pt;margin-top:-1.55pt;width:467.95pt;height:1.45pt;mso-wrap-style:none;v-text-anchor:middle;mso-position-vertical:top">
                 <v:fill o:detectmouseclick="t" type="solid" color2="black"/>
                 <v:stroke color="black" joinstyle="round" endcap="flat"/>
                 <w10:wrap type="square"/>
@@ -858,7 +858,7 @@
         <w:pStyle w:val="Compact"/>
         <w:numPr>
           <w:ilvl w:val="0"/>
-          <w:numId w:val="41"/>
+          <w:numId w:val="1"/>
         </w:numPr>
         <w:rPr/>
       </w:pPr>
@@ -900,7 +900,7 @@
         <w:pStyle w:val="Compact"/>
         <w:numPr>
           <w:ilvl w:val="0"/>
-          <w:numId w:val="42"/>
+          <w:numId w:val="1"/>
         </w:numPr>
         <w:rPr/>
       </w:pPr>
@@ -909,19 +909,18 @@
           <w:b/>
           <w:bCs/>
         </w:rPr>
-        <w:t>Oct 2024–Present</w:t>
-      </w:r>
-      <w:r>
-        <w:rPr/>
-        <w:t xml:space="preserve">: Application Security Officer, Stena </w:t>
-      </w:r>
-      <w:r>
-        <w:rPr/>
-        <w:t>AB</w:t>
-      </w:r>
-      <w:r>
-        <w:rPr/>
-        <w:t xml:space="preserve"> – Enhanced SDLC, threat modeling, global bug bounty management, security champion forums, cross-subsidiary governance.</w:t>
+        <w:t>Oct 2024–</w:t>
+      </w:r>
+      <w:r>
+        <w:rPr>
+          <w:b/>
+          <w:bCs/>
+        </w:rPr>
+        <w:t>Jul 2025</w:t>
+      </w:r>
+      <w:r>
+        <w:rPr/>
+        <w:t>: Application Security Officer, Stena AB – Enhanced SDLC, threat modeling, global bug bounty management, security champion forums, cross-subsidiary governance.</w:t>
       </w:r>
     </w:p>
     <w:p>
@@ -929,7 +928,7 @@
         <w:pStyle w:val="Compact"/>
         <w:numPr>
           <w:ilvl w:val="0"/>
-          <w:numId w:val="43"/>
+          <w:numId w:val="1"/>
         </w:numPr>
         <w:rPr/>
       </w:pPr>
@@ -950,7 +949,7 @@
         <w:pStyle w:val="Compact"/>
         <w:numPr>
           <w:ilvl w:val="0"/>
-          <w:numId w:val="44"/>
+          <w:numId w:val="1"/>
         </w:numPr>
         <w:rPr/>
       </w:pPr>
@@ -984,7 +983,7 @@
         <w:pStyle w:val="Compact"/>
         <w:numPr>
           <w:ilvl w:val="0"/>
-          <w:numId w:val="45"/>
+          <w:numId w:val="1"/>
         </w:numPr>
         <w:rPr/>
       </w:pPr>
@@ -1005,7 +1004,7 @@
         <w:pStyle w:val="Compact"/>
         <w:numPr>
           <w:ilvl w:val="0"/>
-          <w:numId w:val="46"/>
+          <w:numId w:val="1"/>
         </w:numPr>
         <w:rPr/>
       </w:pPr>
@@ -1039,7 +1038,7 @@
         <w:pStyle w:val="Compact"/>
         <w:numPr>
           <w:ilvl w:val="0"/>
-          <w:numId w:val="47"/>
+          <w:numId w:val="1"/>
         </w:numPr>
         <w:rPr/>
       </w:pPr>
@@ -1060,7 +1059,7 @@
         <w:pStyle w:val="Compact"/>
         <w:numPr>
           <w:ilvl w:val="0"/>
-          <w:numId w:val="48"/>
+          <w:numId w:val="1"/>
         </w:numPr>
         <w:rPr/>
       </w:pPr>
@@ -1081,7 +1080,7 @@
         <w:pStyle w:val="Compact"/>
         <w:numPr>
           <w:ilvl w:val="0"/>
-          <w:numId w:val="49"/>
+          <w:numId w:val="1"/>
         </w:numPr>
         <w:rPr/>
       </w:pPr>
@@ -1102,7 +1101,7 @@
         <w:pStyle w:val="Compact"/>
         <w:numPr>
           <w:ilvl w:val="0"/>
-          <w:numId w:val="50"/>
+          <w:numId w:val="1"/>
         </w:numPr>
         <w:rPr/>
       </w:pPr>
@@ -1123,7 +1122,7 @@
         <w:pStyle w:val="Compact"/>
         <w:numPr>
           <w:ilvl w:val="0"/>
-          <w:numId w:val="51"/>
+          <w:numId w:val="1"/>
         </w:numPr>
         <w:rPr/>
       </w:pPr>
@@ -1157,7 +1156,7 @@
         <w:pStyle w:val="Compact"/>
         <w:numPr>
           <w:ilvl w:val="0"/>
-          <w:numId w:val="52"/>
+          <w:numId w:val="1"/>
         </w:numPr>
         <w:rPr/>
       </w:pPr>
@@ -1178,7 +1177,7 @@
         <w:pStyle w:val="Compact"/>
         <w:numPr>
           <w:ilvl w:val="0"/>
-          <w:numId w:val="53"/>
+          <w:numId w:val="1"/>
         </w:numPr>
         <w:rPr/>
       </w:pPr>
@@ -1199,7 +1198,7 @@
         <w:pStyle w:val="Compact"/>
         <w:numPr>
           <w:ilvl w:val="0"/>
-          <w:numId w:val="54"/>
+          <w:numId w:val="1"/>
         </w:numPr>
         <w:rPr/>
       </w:pPr>
@@ -1233,7 +1232,7 @@
         <w:pStyle w:val="Compact"/>
         <w:numPr>
           <w:ilvl w:val="0"/>
-          <w:numId w:val="55"/>
+          <w:numId w:val="1"/>
         </w:numPr>
         <w:rPr/>
       </w:pPr>
@@ -1254,7 +1253,7 @@
         <w:pStyle w:val="Compact"/>
         <w:numPr>
           <w:ilvl w:val="0"/>
-          <w:numId w:val="56"/>
+          <w:numId w:val="1"/>
         </w:numPr>
         <w:rPr/>
       </w:pPr>
@@ -1323,7 +1322,7 @@
           </mc:Choice>
           <mc:Fallback>
             <w:pict>
-              <v:rect id="shape_0" ID="Shape4" path="m0,0l-2147483645,0l-2147483645,-2147483646l0,-2147483646xe" fillcolor="white" stroked="t" o:allowincell="f" style="position:absolute;margin-left:0pt;margin-top:-1.55pt;width:467.95pt;height:1.45pt;mso-wrap-style:none;v-text-anchor:middle;mso-position-vertical:top">
+              <v:rect id="shape_0" fillcolor="white" stroked="t" o:allowincell="f" style="position:absolute;margin-left:0pt;margin-top:-1.55pt;width:467.95pt;height:1.45pt;mso-wrap-style:none;v-text-anchor:middle;mso-position-vertical:top">
                 <v:fill o:detectmouseclick="t" type="solid" color2="black"/>
                 <v:stroke color="black" joinstyle="round" endcap="flat"/>
                 <w10:wrap type="square"/>
@@ -1507,7 +1506,7 @@
           </mc:Choice>
           <mc:Fallback>
             <w:pict>
-              <v:rect id="shape_0" ID="Shape5" path="m0,0l-2147483645,0l-2147483645,-2147483646l0,-2147483646xe" fillcolor="white" stroked="t" o:allowincell="f" style="position:absolute;margin-left:0pt;margin-top:-1.55pt;width:467.95pt;height:1.45pt;mso-wrap-style:none;v-text-anchor:middle;mso-position-vertical:top">
+              <v:rect id="shape_0" fillcolor="white" stroked="t" o:allowincell="f" style="position:absolute;margin-left:0pt;margin-top:-1.55pt;width:467.95pt;height:1.45pt;mso-wrap-style:none;v-text-anchor:middle;mso-position-vertical:top">
                 <v:fill o:detectmouseclick="t" type="solid" color2="black"/>
                 <v:stroke color="black" joinstyle="round" endcap="flat"/>
                 <w10:wrap type="square"/>
@@ -1570,7 +1569,7 @@
           </mc:Choice>
           <mc:Fallback>
             <w:pict>
-              <v:rect id="shape_0" ID="Shape6" path="m0,0l-2147483645,0l-2147483645,-2147483646l0,-2147483646xe" fillcolor="white" stroked="t" o:allowincell="f" style="position:absolute;margin-left:0pt;margin-top:-1.55pt;width:467.95pt;height:1.45pt;mso-wrap-style:none;v-text-anchor:middle;mso-position-vertical:top">
+              <v:rect id="shape_0" fillcolor="white" stroked="t" o:allowincell="f" style="position:absolute;margin-left:0pt;margin-top:-1.55pt;width:467.95pt;height:1.45pt;mso-wrap-style:none;v-text-anchor:middle;mso-position-vertical:top">
                 <v:fill o:detectmouseclick="t" type="solid" color2="black"/>
                 <v:stroke color="black" joinstyle="round" endcap="flat"/>
                 <w10:wrap type="square"/>
@@ -5667,87 +5666,6 @@
   <w:num w:numId="29">
     <w:abstractNumId w:val="29"/>
   </w:num>
-  <w:num w:numId="30">
-    <w:abstractNumId w:val="1"/>
-  </w:num>
-  <w:num w:numId="31">
-    <w:abstractNumId w:val="1"/>
-  </w:num>
-  <w:num w:numId="32">
-    <w:abstractNumId w:val="1"/>
-  </w:num>
-  <w:num w:numId="33">
-    <w:abstractNumId w:val="1"/>
-  </w:num>
-  <w:num w:numId="34">
-    <w:abstractNumId w:val="1"/>
-  </w:num>
-  <w:num w:numId="35">
-    <w:abstractNumId w:val="1"/>
-  </w:num>
-  <w:num w:numId="36">
-    <w:abstractNumId w:val="1"/>
-  </w:num>
-  <w:num w:numId="37">
-    <w:abstractNumId w:val="1"/>
-  </w:num>
-  <w:num w:numId="38">
-    <w:abstractNumId w:val="1"/>
-  </w:num>
-  <w:num w:numId="39">
-    <w:abstractNumId w:val="1"/>
-  </w:num>
-  <w:num w:numId="40">
-    <w:abstractNumId w:val="1"/>
-  </w:num>
-  <w:num w:numId="41">
-    <w:abstractNumId w:val="1"/>
-  </w:num>
-  <w:num w:numId="42">
-    <w:abstractNumId w:val="1"/>
-  </w:num>
-  <w:num w:numId="43">
-    <w:abstractNumId w:val="1"/>
-  </w:num>
-  <w:num w:numId="44">
-    <w:abstractNumId w:val="1"/>
-  </w:num>
-  <w:num w:numId="45">
-    <w:abstractNumId w:val="1"/>
-  </w:num>
-  <w:num w:numId="46">
-    <w:abstractNumId w:val="1"/>
-  </w:num>
-  <w:num w:numId="47">
-    <w:abstractNumId w:val="1"/>
-  </w:num>
-  <w:num w:numId="48">
-    <w:abstractNumId w:val="1"/>
-  </w:num>
-  <w:num w:numId="49">
-    <w:abstractNumId w:val="1"/>
-  </w:num>
-  <w:num w:numId="50">
-    <w:abstractNumId w:val="1"/>
-  </w:num>
-  <w:num w:numId="51">
-    <w:abstractNumId w:val="1"/>
-  </w:num>
-  <w:num w:numId="52">
-    <w:abstractNumId w:val="1"/>
-  </w:num>
-  <w:num w:numId="53">
-    <w:abstractNumId w:val="1"/>
-  </w:num>
-  <w:num w:numId="54">
-    <w:abstractNumId w:val="1"/>
-  </w:num>
-  <w:num w:numId="55">
-    <w:abstractNumId w:val="1"/>
-  </w:num>
-  <w:num w:numId="56">
-    <w:abstractNumId w:val="1"/>
-  </w:num>
 </w:numbering>
 </file>
 
@@ -5789,7 +5707,7 @@
     </w:rPr>
   </w:style>
   <w:style w:type="paragraph" w:styleId="Heading1">
-    <w:name w:val="Heading 1"/>
+    <w:name w:val="heading 1"/>
     <w:basedOn w:val="Normal"/>
     <w:next w:val="BodyText"/>
     <w:link w:val="Heading1Char"/>
@@ -5810,7 +5728,7 @@
     </w:rPr>
   </w:style>
   <w:style w:type="paragraph" w:styleId="Heading2">
-    <w:name w:val="Heading 2"/>
+    <w:name w:val="heading 2"/>
     <w:basedOn w:val="Normal"/>
     <w:next w:val="BodyText"/>
     <w:link w:val="Heading2Char"/>
@@ -5833,7 +5751,7 @@
     </w:rPr>
   </w:style>
   <w:style w:type="paragraph" w:styleId="Heading3">
-    <w:name w:val="Heading 3"/>
+    <w:name w:val="heading 3"/>
     <w:basedOn w:val="Normal"/>
     <w:next w:val="BodyText"/>
     <w:link w:val="Heading3Char"/>
@@ -5856,7 +5774,7 @@
     </w:rPr>
   </w:style>
   <w:style w:type="paragraph" w:styleId="Heading4">
-    <w:name w:val="Heading 4"/>
+    <w:name w:val="heading 4"/>
     <w:basedOn w:val="Normal"/>
     <w:next w:val="BodyText"/>
     <w:link w:val="Heading4Char"/>
@@ -5879,7 +5797,7 @@
     </w:rPr>
   </w:style>
   <w:style w:type="paragraph" w:styleId="Heading5">
-    <w:name w:val="Heading 5"/>
+    <w:name w:val="heading 5"/>
     <w:basedOn w:val="Normal"/>
     <w:next w:val="BodyText"/>
     <w:link w:val="Heading5Char"/>
@@ -5900,7 +5818,7 @@
     </w:rPr>
   </w:style>
   <w:style w:type="paragraph" w:styleId="Heading6">
-    <w:name w:val="Heading 6"/>
+    <w:name w:val="heading 6"/>
     <w:basedOn w:val="Normal"/>
     <w:next w:val="BodyText"/>
     <w:link w:val="Heading6Char"/>
@@ -5923,7 +5841,7 @@
     </w:rPr>
   </w:style>
   <w:style w:type="paragraph" w:styleId="Heading7">
-    <w:name w:val="Heading 7"/>
+    <w:name w:val="heading 7"/>
     <w:basedOn w:val="Normal"/>
     <w:next w:val="BodyText"/>
     <w:link w:val="Heading7Char"/>
@@ -5944,7 +5862,7 @@
     </w:rPr>
   </w:style>
   <w:style w:type="paragraph" w:styleId="Heading8">
-    <w:name w:val="Heading 8"/>
+    <w:name w:val="heading 8"/>
     <w:basedOn w:val="Normal"/>
     <w:next w:val="BodyText"/>
     <w:link w:val="Heading8Char"/>
@@ -5967,7 +5885,7 @@
     </w:rPr>
   </w:style>
   <w:style w:type="paragraph" w:styleId="Heading9">
-    <w:name w:val="Heading 9"/>
+    <w:name w:val="heading 9"/>
     <w:basedOn w:val="Normal"/>
     <w:next w:val="BodyText"/>
     <w:link w:val="Heading9Char"/>
@@ -6173,15 +6091,22 @@
     <w:qFormat/>
     <w:rPr/>
   </w:style>
-  <w:style w:type="character" w:styleId="FootnoteCharacters">
-    <w:name w:val="Footnote Characters"/>
+  <w:style w:type="character" w:styleId="FootnoteCharactersuser">
+    <w:name w:val="Footnote Characters (user)"/>
     <w:qFormat/>
     <w:rPr>
       <w:vertAlign w:val="superscript"/>
     </w:rPr>
   </w:style>
+  <w:style w:type="character" w:styleId="FootnoteCharacters">
+    <w:name w:val="Footnote Characters"/>
+    <w:qFormat/>
+    <w:rPr>
+      <w:vertAlign w:val="superscript"/>
+    </w:rPr>
+  </w:style>
   <w:style w:type="character" w:styleId="FootnoteReference">
-    <w:name w:val="Footnote Reference"/>
+    <w:name w:val="footnote reference"/>
     <w:rPr>
       <w:vertAlign w:val="superscript"/>
     </w:rPr>
@@ -6484,7 +6409,7 @@
     </w:rPr>
   </w:style>
   <w:style w:type="paragraph" w:styleId="Caption">
-    <w:name w:val="Caption"/>
+    <w:name w:val="caption"/>
     <w:basedOn w:val="Normal"/>
     <w:link w:val="BodyTextChar"/>
     <w:qFormat/>
@@ -6657,7 +6582,7 @@
     <w:rPr/>
   </w:style>
   <w:style w:type="paragraph" w:styleId="FootnoteText">
-    <w:name w:val="Footnote Text"/>
+    <w:name w:val="footnote text"/>
     <w:basedOn w:val="Normal"/>
     <w:uiPriority w:val="9"/>
     <w:unhideWhenUsed/>
@@ -6732,7 +6657,7 @@
     <w:rPr/>
   </w:style>
   <w:style w:type="paragraph" w:styleId="IndexHeading">
-    <w:name w:val="Index Heading"/>
+    <w:name w:val="index heading"/>
     <w:basedOn w:val="Heading"/>
     <w:pPr/>
     <w:rPr/>

</xml_diff>